<commit_message>
Clarify type-hint table for all 11 inputs in beginner guides
</commit_message>
<xml_diff>
--- a/Grasshopper/BEGINNERS_GUIDE.docx
+++ b/Grasshopper/BEGINNERS_GUIDE.docx
@@ -1356,95 +1356,315 @@
         <w:pStyle w:val="ListBullet"/>
       </w:pPr>
       <w:r>
-        <w:t xml:space="preserve">For </w:t>
+        <w:t>Pick exactly one of these for each input:</w:t>
+      </w:r>
+    </w:p>
+    <w:p/>
+    <w:tbl>
+      <w:tblPr>
+        <w:tblStyle w:val="LightGrid-Accent1"/>
+        <w:tblW w:type="auto" w:w="0"/>
+        <w:tblLook w:firstColumn="1" w:firstRow="1" w:lastColumn="0" w:lastRow="0" w:noHBand="0" w:noVBand="1" w:val="04A0"/>
+      </w:tblPr>
+      <w:tblGrid>
+        <w:gridCol w:w="4320"/>
+        <w:gridCol w:w="4320"/>
+      </w:tblGrid>
+      <w:tr>
+        <w:tc>
+          <w:tcPr>
+            <w:tcW w:type="dxa" w:w="4320"/>
+          </w:tcPr>
+          <w:p>
+            <w:r>
+              <w:rPr>
+                <w:b/>
+              </w:rPr>
+              <w:t>Input</w:t>
+            </w:r>
+          </w:p>
+        </w:tc>
+        <w:tc>
+          <w:tcPr>
+            <w:tcW w:type="dxa" w:w="4320"/>
+          </w:tcPr>
+          <w:p>
+            <w:r>
+              <w:rPr>
+                <w:b/>
+              </w:rPr>
+              <w:t>Type hint</w:t>
+            </w:r>
+          </w:p>
+        </w:tc>
+      </w:tr>
+      <w:tr>
+        <w:tc>
+          <w:tcPr>
+            <w:tcW w:type="dxa" w:w="4320"/>
+          </w:tcPr>
+          <w:p>
+            <w:r>
+              <w:t>`Last`</w:t>
+            </w:r>
+          </w:p>
+        </w:tc>
+        <w:tc>
+          <w:tcPr>
+            <w:tcW w:type="dxa" w:w="4320"/>
+          </w:tcPr>
+          <w:p>
+            <w:r>
+              <w:t>**Brep**</w:t>
+            </w:r>
+          </w:p>
+        </w:tc>
+      </w:tr>
+      <w:tr>
+        <w:tc>
+          <w:tcPr>
+            <w:tcW w:type="dxa" w:w="4320"/>
+          </w:tcPr>
+          <w:p>
+            <w:r>
+              <w:t>`OverrideOutline`</w:t>
+            </w:r>
+          </w:p>
+        </w:tc>
+        <w:tc>
+          <w:tcPr>
+            <w:tcW w:type="dxa" w:w="4320"/>
+          </w:tcPr>
+          <w:p>
+            <w:r>
+              <w:t>**Curve**</w:t>
+            </w:r>
+          </w:p>
+        </w:tc>
+      </w:tr>
+      <w:tr>
+        <w:tc>
+          <w:tcPr>
+            <w:tcW w:type="dxa" w:w="4320"/>
+          </w:tcPr>
+          <w:p>
+            <w:r>
+              <w:t>`OverrideBottom`</w:t>
+            </w:r>
+          </w:p>
+        </w:tc>
+        <w:tc>
+          <w:tcPr>
+            <w:tcW w:type="dxa" w:w="4320"/>
+          </w:tcPr>
+          <w:p>
+            <w:r>
+              <w:t>**Curve**</w:t>
+            </w:r>
+          </w:p>
+        </w:tc>
+      </w:tr>
+      <w:tr>
+        <w:tc>
+          <w:tcPr>
+            <w:tcW w:type="dxa" w:w="4320"/>
+          </w:tcPr>
+          <w:p>
+            <w:r>
+              <w:t>`PerimeterOffset`</w:t>
+            </w:r>
+          </w:p>
+        </w:tc>
+        <w:tc>
+          <w:tcPr>
+            <w:tcW w:type="dxa" w:w="4320"/>
+          </w:tcPr>
+          <w:p>
+            <w:r>
+              <w:t>**float**</w:t>
+            </w:r>
+          </w:p>
+        </w:tc>
+      </w:tr>
+      <w:tr>
+        <w:tc>
+          <w:tcPr>
+            <w:tcW w:type="dxa" w:w="4320"/>
+          </w:tcPr>
+          <w:p>
+            <w:r>
+              <w:t>`ToeExtension`</w:t>
+            </w:r>
+          </w:p>
+        </w:tc>
+        <w:tc>
+          <w:tcPr>
+            <w:tcW w:type="dxa" w:w="4320"/>
+          </w:tcPr>
+          <w:p>
+            <w:r>
+              <w:t>**float**</w:t>
+            </w:r>
+          </w:p>
+        </w:tc>
+      </w:tr>
+      <w:tr>
+        <w:tc>
+          <w:tcPr>
+            <w:tcW w:type="dxa" w:w="4320"/>
+          </w:tcPr>
+          <w:p>
+            <w:r>
+              <w:t>`HeelExtension`</w:t>
+            </w:r>
+          </w:p>
+        </w:tc>
+        <w:tc>
+          <w:tcPr>
+            <w:tcW w:type="dxa" w:w="4320"/>
+          </w:tcPr>
+          <w:p>
+            <w:r>
+              <w:t>**float**</w:t>
+            </w:r>
+          </w:p>
+        </w:tc>
+      </w:tr>
+      <w:tr>
+        <w:tc>
+          <w:tcPr>
+            <w:tcW w:type="dxa" w:w="4320"/>
+          </w:tcPr>
+          <w:p>
+            <w:r>
+              <w:t>`CoverThk`</w:t>
+            </w:r>
+          </w:p>
+        </w:tc>
+        <w:tc>
+          <w:tcPr>
+            <w:tcW w:type="dxa" w:w="4320"/>
+          </w:tcPr>
+          <w:p>
+            <w:r>
+              <w:t>**float**</w:t>
+            </w:r>
+          </w:p>
+        </w:tc>
+      </w:tr>
+      <w:tr>
+        <w:tc>
+          <w:tcPr>
+            <w:tcW w:type="dxa" w:w="4320"/>
+          </w:tcPr>
+          <w:p>
+            <w:r>
+              <w:t>`ShellThk`</w:t>
+            </w:r>
+          </w:p>
+        </w:tc>
+        <w:tc>
+          <w:tcPr>
+            <w:tcW w:type="dxa" w:w="4320"/>
+          </w:tcPr>
+          <w:p>
+            <w:r>
+              <w:t>**float**</w:t>
+            </w:r>
+          </w:p>
+        </w:tc>
+      </w:tr>
+      <w:tr>
+        <w:tc>
+          <w:tcPr>
+            <w:tcW w:type="dxa" w:w="4320"/>
+          </w:tcPr>
+          <w:p>
+            <w:r>
+              <w:t>`BaseThk`</w:t>
+            </w:r>
+          </w:p>
+        </w:tc>
+        <w:tc>
+          <w:tcPr>
+            <w:tcW w:type="dxa" w:w="4320"/>
+          </w:tcPr>
+          <w:p>
+            <w:r>
+              <w:t>**float**</w:t>
+            </w:r>
+          </w:p>
+        </w:tc>
+      </w:tr>
+      <w:tr>
+        <w:tc>
+          <w:tcPr>
+            <w:tcW w:type="dxa" w:w="4320"/>
+          </w:tcPr>
+          <w:p>
+            <w:r>
+              <w:t>`MaxEdge`</w:t>
+            </w:r>
+          </w:p>
+        </w:tc>
+        <w:tc>
+          <w:tcPr>
+            <w:tcW w:type="dxa" w:w="4320"/>
+          </w:tcPr>
+          <w:p>
+            <w:r>
+              <w:t>**float**</w:t>
+            </w:r>
+          </w:p>
+        </w:tc>
+      </w:tr>
+      <w:tr>
+        <w:tc>
+          <w:tcPr>
+            <w:tcW w:type="dxa" w:w="4320"/>
+          </w:tcPr>
+          <w:p>
+            <w:r>
+              <w:t>`MinEdge`</w:t>
+            </w:r>
+          </w:p>
+        </w:tc>
+        <w:tc>
+          <w:tcPr>
+            <w:tcW w:type="dxa" w:w="4320"/>
+          </w:tcPr>
+          <w:p>
+            <w:r>
+              <w:t>**float**</w:t>
+            </w:r>
+          </w:p>
+        </w:tc>
+      </w:tr>
+    </w:tbl>
+    <w:p/>
+    <w:p>
+      <w:r>
+        <w:t xml:space="preserve">If your GH version shows </w:t>
       </w:r>
       <w:r>
         <w:rPr>
           <w:rFonts w:ascii="Consolas" w:hAnsi="Consolas"/>
           <w:sz w:val="20"/>
         </w:rPr>
-        <w:t>Last</w:t>
-      </w:r>
-      <w:r>
-        <w:t xml:space="preserve"> / </w:t>
+        <w:t>Number</w:t>
+      </w:r>
+      <w:r>
+        <w:t xml:space="preserve"> instead of </w:t>
       </w:r>
       <w:r>
         <w:rPr>
           <w:rFonts w:ascii="Consolas" w:hAnsi="Consolas"/>
           <w:sz w:val="20"/>
         </w:rPr>
-        <w:t>OverrideOutline</w:t>
-      </w:r>
-      <w:r>
-        <w:t xml:space="preserve"> / </w:t>
-      </w:r>
-      <w:r>
-        <w:rPr>
-          <w:rFonts w:ascii="Consolas" w:hAnsi="Consolas"/>
-          <w:sz w:val="20"/>
-        </w:rPr>
-        <w:t>OverrideBottom</w:t>
-      </w:r>
-      <w:r>
-        <w:t xml:space="preserve">: pick </w:t>
-      </w:r>
-      <w:r>
-        <w:rPr>
-          <w:b/>
-        </w:rPr>
-        <w:t>Brep</w:t>
-      </w:r>
-      <w:r>
-        <w:t xml:space="preserve"> /</w:t>
-      </w:r>
-    </w:p>
-    <w:p>
-      <w:r>
-        <w:t xml:space="preserve">  </w:t>
-      </w:r>
-      <w:r>
-        <w:rPr>
-          <w:b/>
-        </w:rPr>
-        <w:t>Curve</w:t>
-      </w:r>
-      <w:r>
-        <w:t xml:space="preserve"> / </w:t>
-      </w:r>
-      <w:r>
-        <w:rPr>
-          <w:b/>
-        </w:rPr>
-        <w:t>Curve</w:t>
-      </w:r>
-      <w:r>
-        <w:t>.</w:t>
-      </w:r>
-    </w:p>
-    <w:p>
-      <w:pPr>
-        <w:pStyle w:val="ListBullet"/>
-      </w:pPr>
-      <w:r>
-        <w:t xml:space="preserve">For numeric inputs: pick </w:t>
-      </w:r>
-      <w:r>
-        <w:rPr>
-          <w:b/>
-        </w:rPr>
         <w:t>float</w:t>
       </w:r>
       <w:r>
-        <w:t xml:space="preserve"> (or </w:t>
-      </w:r>
-      <w:r>
-        <w:rPr>
-          <w:b/>
-        </w:rPr>
-        <w:t>Number</w:t>
-      </w:r>
-      <w:r>
-        <w:t>).</w:t>
+        <w:t>, pick that — same thing.</w:t>
       </w:r>
     </w:p>
     <w:p/>

</xml_diff>

<commit_message>
Add RebuildCount (int) to type-hint table in beginner guides
</commit_message>
<xml_diff>
--- a/Grasshopper/BEGINNERS_GUIDE.docx
+++ b/Grasshopper/BEGINNERS_GUIDE.docx
@@ -1640,6 +1640,28 @@
           </w:p>
         </w:tc>
       </w:tr>
+      <w:tr>
+        <w:tc>
+          <w:tcPr>
+            <w:tcW w:type="dxa" w:w="4320"/>
+          </w:tcPr>
+          <w:p>
+            <w:r>
+              <w:t>`RebuildCount`</w:t>
+            </w:r>
+          </w:p>
+        </w:tc>
+        <w:tc>
+          <w:tcPr>
+            <w:tcW w:type="dxa" w:w="4320"/>
+          </w:tcPr>
+          <w:p>
+            <w:r>
+              <w:t>**int**</w:t>
+            </w:r>
+          </w:p>
+        </w:tc>
+      </w:tr>
     </w:tbl>
     <w:p/>
     <w:p>
@@ -1665,6 +1687,39 @@
       </w:r>
       <w:r>
         <w:t>, pick that — same thing.</w:t>
+      </w:r>
+    </w:p>
+    <w:p/>
+    <w:p>
+      <w:r>
+        <w:rPr>
+          <w:rFonts w:ascii="Consolas" w:hAnsi="Consolas"/>
+          <w:sz w:val="20"/>
+        </w:rPr>
+        <w:t>RebuildCount</w:t>
+      </w:r>
+      <w:r>
+        <w:t xml:space="preserve"> is optional. Leave it unwired and the script uses 20 (a good</w:t>
+      </w:r>
+    </w:p>
+    <w:p>
+      <w:r>
+        <w:t>default). Add it only if you want to tune how many control points the output</w:t>
+      </w:r>
+    </w:p>
+    <w:p>
+      <w:r>
+        <w:t xml:space="preserve">curves have — feed it from a slider like </w:t>
+      </w:r>
+      <w:r>
+        <w:rPr>
+          <w:rFonts w:ascii="Consolas" w:hAnsi="Consolas"/>
+          <w:sz w:val="20"/>
+        </w:rPr>
+        <w:t>20..8..60</w:t>
+      </w:r>
+      <w:r>
+        <w:t>.</w:t>
       </w:r>
     </w:p>
     <w:p/>

</xml_diff>